<commit_message>
Unify meeting result generation and refresh product docs
</commit_message>
<xml_diff>
--- a/meeting_product_brief_v2.docx
+++ b/meeting_product_brief_v2.docx
@@ -19,7 +19,7 @@
         <w:rPr>
           <w:b/>
         </w:rPr>
-        <w:t>Qwen 双模型 + 自动语言/方言判断 + 段落式输出</w:t>
+        <w:t>Qwen 1.7B 单模型 + 同模语言确认 + 段落式输出</w:t>
       </w:r>
     </w:p>
     <w:p>
@@ -35,7 +35,7 @@
         <w:rPr>
           <w:b w:val="0"/>
         </w:rPr>
-        <w:t>系统在录音期间持续输出可读的会议段落：Qwen3-ASR-0.6B 负责识别语言和中文方言，Qwen3-ASR-1.7B 负责实时转写；英文和德文通过本地 OPUS-MT 翻译为简体中文，中文及中文方言直接规范为简体中文。</w:t>
+        <w:t>系统在录音期间持续输出可读的会议段落：唯一常驻的 Qwen3-ASR-1.7B 同时负责最终 ASR、分段级语言确认和语言冲突重识别；英文和德文通过本地 OPUS-MT 翻译为简体中文，中文及中文方言直接规范为简体中文。</w:t>
       </w:r>
     </w:p>
     <w:p>
@@ -51,7 +51,7 @@
         <w:pStyle w:val="ListBullet"/>
       </w:pPr>
       <w:r>
-        <w:t>静音达到阈值或语言/方言稳定切换时结束段落；技术性音频切分不会制造额外显示段落。</w:t>
+        <w:t>静音达到阈值或语言稳定切换时结束段落；时间戳音频帧用于按确认时刻重切片，技术性音频切分不会制造额外显示段落。</w:t>
       </w:r>
     </w:p>
     <w:p>
@@ -59,7 +59,7 @@
         <w:pStyle w:val="ListBullet"/>
       </w:pPr>
       <w:r>
-        <w:t>系统不保存人员身份、手动语言锁定或会后第二套 ASR 结果。</w:t>
+        <w:t>系统不保存人员身份、手动语言锁定或会后第二套 ASR 结果；本地会后复译默认关闭。</w:t>
       </w:r>
     </w:p>
     <w:p>
@@ -128,7 +128,7 @@
           </w:tcPr>
           <w:p>
             <w:r>
-              <w:t>实时 ASR</w:t>
+              <w:t>实时 ASR、语言确认与冲突重识别</w:t>
             </w:r>
           </w:p>
         </w:tc>
@@ -148,7 +148,7 @@
           </w:tcPr>
           <w:p>
             <w:r>
-              <w:t>en=English；de=German；中文=Chinese；粤语=Cantonese；四川话/吴语使用 Chinese 加上下文提示。</w:t>
+              <w:t>同一 checkpoint 负责最终识别、约 1 秒后的分段语言探测和冲突重识别；en=English、de=German，中文及方言使用对应上下文提示。</w:t>
             </w:r>
           </w:p>
         </w:tc>
@@ -160,7 +160,7 @@
           </w:tcPr>
           <w:p>
             <w:r>
-              <w:t>语言/方言判断</w:t>
+              <w:t>兼容回退配置</w:t>
             </w:r>
           </w:p>
         </w:tc>
@@ -170,7 +170,7 @@
           </w:tcPr>
           <w:p>
             <w:r>
-              <w:t>Qwen/Qwen3-ASR-0.6B</w:t>
+              <w:t>仍归一到 Qwen/Qwen3-ASR-1.7B</w:t>
             </w:r>
           </w:p>
         </w:tc>
@@ -180,39 +180,7 @@
           </w:tcPr>
           <w:p>
             <w:r>
-              <w:t>新段开始约 0.8 秒判断一次；冲突连续确认，不对每个 partial 调用。</w:t>
-            </w:r>
-          </w:p>
-        </w:tc>
-      </w:tr>
-      <w:tr>
-        <w:tc>
-          <w:tcPr>
-            <w:tcW w:type="dxa" w:w="3360"/>
-          </w:tcPr>
-          <w:p>
-            <w:r>
-              <w:t>实时失败回退</w:t>
-            </w:r>
-          </w:p>
-        </w:tc>
-        <w:tc>
-          <w:tcPr>
-            <w:tcW w:type="dxa" w:w="3360"/>
-          </w:tcPr>
-          <w:p>
-            <w:r>
-              <w:t>Qwen/Qwen3-ASR-0.6B</w:t>
-            </w:r>
-          </w:p>
-        </w:tc>
-        <w:tc>
-          <w:tcPr>
-            <w:tcW w:type="dxa" w:w="3360"/>
-          </w:tcPr>
-          <w:p>
-            <w:r>
-              <w:t>主模型异常时继续输出，并保留实际使用的 asr_model。</w:t>
+              <w:t>旧 fallback/LID 配置字段保留以兼容 API，但单模型模式不加载 0.6B，也不切换第二个 ASR。</w:t>
             </w:r>
           </w:p>
         </w:tc>
@@ -244,7 +212,7 @@
           </w:tcPr>
           <w:p>
             <w:r>
-              <w:t>按稳定原文前缀顺序翻译；旧 source_revision 结果丢弃。</w:t>
+              <w:t>稳定前缀异步翻译；按 segment_id 合并任务，source_revision 过期结果丢弃；服务启动时 warm-up。</w:t>
             </w:r>
           </w:p>
         </w:tc>
@@ -276,7 +244,7 @@
           </w:tcPr>
           <w:p>
             <w:r>
-              <w:t>保留既有音频阈值与静音结束机制。</w:t>
+              <w:t>保留既有音频阈值与静音结束机制，并保留带时间戳的音频帧。</w:t>
             </w:r>
           </w:p>
         </w:tc>
@@ -295,7 +263,7 @@
         <w:rPr>
           <w:b w:val="0"/>
         </w:rPr>
-        <w:t>浏览器 PCM 音频 → VAD/技术分段 → 0.6B 语言判断 → 1.7B 实时 ASR → 段落聚合器 → 稳定前缀翻译队列 → TranscriptStore 与 paragraph_update → 前端段落卡片。</w:t>
+        <w:t>浏览器 PCM 音频 → VAD/时间帧保留/技术分段 → Qwen3-ASR-1.7B partial/final → 同模语言证据聚合与时间边界重切片 → 段落聚合器 → segment_id 合并翻译队列 → TranscriptStore 与 paragraph_update → 前端段落卡片。</w:t>
       </w:r>
     </w:p>
     <w:p>
@@ -303,7 +271,7 @@
         <w:pStyle w:val="ListBullet"/>
       </w:pPr>
       <w:r>
-        <w:t>首次语言判断只形成候选；相同新结果连续确认后才切换稳定语言/方言。短暂 unknown 不切段。</w:t>
+        <w:t>约 1 秒后由同一 Qwen 模型探测语言；新语言需要连续 3 次一致证据才切换，短暂 unknown 被忽略，中文方言只更新 speech_variant。</w:t>
       </w:r>
     </w:p>
     <w:p>
@@ -311,7 +279,7 @@
         <w:pStyle w:val="ListBullet"/>
       </w:pPr>
       <w:r>
-        <w:t>原文 partial 实时更新；译文只对稳定前缀异步更新；段落关闭时使用完整最终原文重新翻译。</w:t>
+        <w:t>语言切换确认后按时间戳切开旧/新窗口再整理 ASR，避免一个 chunk 混入两种语言造成漏字、重复或错序。</w:t>
       </w:r>
     </w:p>
     <w:p>
@@ -319,7 +287,7 @@
         <w:pStyle w:val="ListBullet"/>
       </w:pPr>
       <w:r>
-        <w:t>翻译队列按段落顺序单 worker 执行，失败自动重试；持续失败保留原文并提供 translation/retry。</w:t>
+        <w:t>partial 采用约 1 秒的 latest-wins；final 优先；翻译任务按 segment_id 合并，旧 source_revision 返回后不能覆盖新文本。</w:t>
       </w:r>
     </w:p>
     <w:p>
@@ -327,7 +295,15 @@
         <w:pStyle w:val="ListBullet"/>
       </w:pPr>
       <w:r>
-        <w:t>停止流程：flush 最后音频段 → 等待实时 ASR → 等待翻译队列 → recording_state=complete → ready_for_summary。</w:t>
+        <w:t>翻译使用本地 OPUS-MT 并在启动时 warm-up；会后本地复译默认关闭，后续如有质量需求可单独请求外部翻译智能体。</w:t>
+      </w:r>
+    </w:p>
+    <w:p>
+      <w:pPr>
+        <w:pStyle w:val="ListBullet"/>
+      </w:pPr>
+      <w:r>
+        <w:t>停止流程：flush 最后音频段 → 等待实时 ASR → 等待实时翻译队列 → 跳过默认关闭的会后复译 → recording_state=complete → ready_for_summary。</w:t>
       </w:r>
     </w:p>
     <w:p>
@@ -526,7 +502,7 @@
         <w:pStyle w:val="ListBullet"/>
       </w:pPr>
       <w:r>
-        <w:t>验收覆盖中英德切换、普通话/粤语/四川话/吴语切换、长连续语音、短暂低音量、中英夹杂、噪声和多人同时讲话。</w:t>
+        <w:t>验收覆盖中英德切换、普通话与 Qwen 官方 22 类中文方言代表类别切换、长连续语音、短暂低音量、中英夹杂、噪声和多人同时讲话。</w:t>
       </w:r>
     </w:p>
     <w:p>
@@ -584,6 +560,28 @@
           </w:tcPr>
           <w:p>
             <w:r>
+              <w:t>MEETING_SINGLE_ASR_MODEL</w:t>
+            </w:r>
+          </w:p>
+        </w:tc>
+        <w:tc>
+          <w:tcPr>
+            <w:tcW w:type="dxa" w:w="5040"/>
+          </w:tcPr>
+          <w:p>
+            <w:r>
+              <w:t>1</w:t>
+            </w:r>
+          </w:p>
+        </w:tc>
+      </w:tr>
+      <w:tr>
+        <w:tc>
+          <w:tcPr>
+            <w:tcW w:type="dxa" w:w="5040"/>
+          </w:tcPr>
+          <w:p>
+            <w:r>
               <w:t>MEETING_ASR_PRIMARY</w:t>
             </w:r>
           </w:p>
@@ -616,7 +614,7 @@
           </w:tcPr>
           <w:p>
             <w:r>
-              <w:t>Qwen/Qwen3-ASR-0.6B</w:t>
+              <w:t>Qwen/Qwen3-ASR-1.7B（兼容别名，不加载第二模型）</w:t>
             </w:r>
           </w:p>
         </w:tc>
@@ -638,7 +636,97 @@
           </w:tcPr>
           <w:p>
             <w:r>
-              <w:t>Qwen/Qwen3-ASR-0.6B</w:t>
+              <w:t>Qwen/Qwen3-ASR-1.7B（兼容别名，同模确认）</w:t>
+            </w:r>
+          </w:p>
+        </w:tc>
+      </w:tr>
+      <w:tr>
+        <w:tc>
+          <w:tcPr>
+            <w:tcW w:type="dxa" w:w="5040"/>
+          </w:tcPr>
+          <w:p>
+            <w:r>
+              <w:t>MEETING_PARTIAL_INTERVAL_MS</w:t>
+            </w:r>
+          </w:p>
+        </w:tc>
+        <w:tc>
+          <w:tcPr>
+            <w:tcW w:type="dxa" w:w="5040"/>
+          </w:tcPr>
+          <w:p>
+            <w:r>
+              <w:t>1000</w:t>
+            </w:r>
+          </w:p>
+        </w:tc>
+      </w:tr>
+      <w:tr>
+        <w:tc>
+          <w:tcPr>
+            <w:tcW w:type="dxa" w:w="5040"/>
+          </w:tcPr>
+          <w:p>
+            <w:r>
+              <w:t>MEETING_LANGUAGE_ID_MIN_SECONDS</w:t>
+            </w:r>
+          </w:p>
+        </w:tc>
+        <w:tc>
+          <w:tcPr>
+            <w:tcW w:type="dxa" w:w="5040"/>
+          </w:tcPr>
+          <w:p>
+            <w:r>
+              <w:t>1.0</w:t>
+            </w:r>
+          </w:p>
+        </w:tc>
+      </w:tr>
+      <w:tr>
+        <w:tc>
+          <w:tcPr>
+            <w:tcW w:type="dxa" w:w="5040"/>
+          </w:tcPr>
+          <w:p>
+            <w:r>
+              <w:t>MEETING_LANGUAGE_CONFLICT_</w:t>
+              <w:br/>
+              <w:t>CONFIRMATIONS</w:t>
+            </w:r>
+          </w:p>
+        </w:tc>
+        <w:tc>
+          <w:tcPr>
+            <w:tcW w:type="dxa" w:w="5040"/>
+          </w:tcPr>
+          <w:p>
+            <w:r>
+              <w:t>3</w:t>
+            </w:r>
+          </w:p>
+        </w:tc>
+      </w:tr>
+      <w:tr>
+        <w:tc>
+          <w:tcPr>
+            <w:tcW w:type="dxa" w:w="5040"/>
+          </w:tcPr>
+          <w:p>
+            <w:r>
+              <w:t>MEETING_POST_TRANSLATION_ENABLED</w:t>
+            </w:r>
+          </w:p>
+        </w:tc>
+        <w:tc>
+          <w:tcPr>
+            <w:tcW w:type="dxa" w:w="5040"/>
+          </w:tcPr>
+          <w:p>
+            <w:r>
+              <w:t>0（默认关闭本地会后复译）</w:t>
             </w:r>
           </w:p>
         </w:tc>
@@ -661,28 +749,6 @@
           <w:p>
             <w:r>
               <w:t>2.0</w:t>
-            </w:r>
-          </w:p>
-        </w:tc>
-      </w:tr>
-      <w:tr>
-        <w:tc>
-          <w:tcPr>
-            <w:tcW w:type="dxa" w:w="5040"/>
-          </w:tcPr>
-          <w:p>
-            <w:r>
-              <w:t>language_id_min_seconds</w:t>
-            </w:r>
-          </w:p>
-        </w:tc>
-        <w:tc>
-          <w:tcPr>
-            <w:tcW w:type="dxa" w:w="5040"/>
-          </w:tcPr>
-          <w:p>
-            <w:r>
-              <w:t>0.8</w:t>
             </w:r>
           </w:p>
         </w:tc>

</xml_diff>